<commit_message>
submission_package for Neural Networks v3.0.4
Co-Authored-By: Claude Opus 5.5 (1M context) <noreply@anthropic.com>
</commit_message>
<xml_diff>
--- a/submission_package/03_highlights_NN.docx
+++ b/submission_package/03_highlights_NN.docx
@@ -47,7 +47,7 @@
         <w:spacing w:after="120"/>
       </w:pPr>
       <w:r>
-        <w:t>Head exclusion restores AP without retraining; a KITTI holdout confirms the pattern</w:t>
+        <w:t>Head exclusion recovers INT8 AP; replicated on a KITTI holdout and COCO models</w:t>
       </w:r>
     </w:p>
     <w:p>
@@ -56,7 +56,7 @@
         <w:spacing w:after="120"/>
       </w:pPr>
       <w:r>
-        <w:t>Corruption-aware calibration transfers inconsistently across held-out folds</w:t>
+        <w:t>Corruption-aware calibration transfers inconsistently across held-out families</w:t>
       </w:r>
     </w:p>
     <w:sectPr>

</xml_diff>